<commit_message>
refactor(msword): address review - single-pass cell walk, trim comments, add gridBefore tables to ground truth
Signed-off-by: Daniel Nguyen <danielnguyenh07@gmail.com>
</commit_message>
<xml_diff>
--- a/tests/data/docx/sources/word_tables.docx
+++ b/tests/data/docx/sources/word_tables.docx
@@ -1297,6 +1297,121 @@
     </w:tbl>
     <w:p/>
     <w:p/>
+    <w:p>
+      <w:r>
+        <w:t>A non-uniform table with a row starting late</w:t>
+      </w:r>
+    </w:p>
+    <w:tbl>
+      <w:tblPr>
+        <w:tblStyle w:val="GridTable1Light-Accent1"/>
+        <w:tblW w:type="auto" w:w="0"/>
+        <w:tblLook w:firstColumn="1" w:firstRow="1" w:lastColumn="0" w:lastRow="0" w:noHBand="0" w:noVBand="1" w:val="04A0"/>
+      </w:tblPr>
+      <w:tblGrid>
+        <w:gridCol w:w="4680"/>
+        <w:gridCol w:w="4680"/>
+      </w:tblGrid>
+      <w:tr>
+        <w:tc>
+          <w:tcPr>
+            <w:tcW w:type="dxa" w:w="4680"/>
+          </w:tcPr>
+          <w:p>
+            <w:r>
+              <w:t>Header 0.0</w:t>
+            </w:r>
+          </w:p>
+        </w:tc>
+        <w:tc>
+          <w:tcPr>
+            <w:tcW w:type="dxa" w:w="4680"/>
+          </w:tcPr>
+          <w:p>
+            <w:r>
+              <w:t>Header 0.1</w:t>
+            </w:r>
+          </w:p>
+        </w:tc>
+      </w:tr>
+      <w:tr>
+        <w:trPr>
+          <w:gridBefore w:val="1"/>
+        </w:trPr>
+        <w:tc>
+          <w:tcPr>
+            <w:tcW w:type="dxa" w:w="4680"/>
+          </w:tcPr>
+          <w:p>
+            <w:r>
+              <w:t>Cell 1.1</w:t>
+            </w:r>
+          </w:p>
+        </w:tc>
+      </w:tr>
+    </w:tbl>
+    <w:p>
+      <w:r>
+        <w:t>A non-uniform table with a vertical span over a row starting late</w:t>
+      </w:r>
+    </w:p>
+    <w:tbl>
+      <w:tblPr>
+        <w:tblStyle w:val="GridTable1Light-Accent1"/>
+        <w:tblW w:type="auto" w:w="0"/>
+        <w:tblLook w:firstColumn="1" w:firstRow="1" w:lastColumn="0" w:lastRow="0" w:noHBand="0" w:noVBand="1" w:val="04A0"/>
+      </w:tblPr>
+      <w:tblGrid>
+        <w:gridCol w:w="3120"/>
+        <w:gridCol w:w="3120"/>
+        <w:gridCol w:w="3120"/>
+      </w:tblGrid>
+      <w:tr>
+        <w:tc>
+          <w:tcPr>
+            <w:tcW w:type="dxa" w:w="3120"/>
+          </w:tcPr>
+          <w:p>
+            <w:r>
+              <w:t>Header 0.0</w:t>
+            </w:r>
+          </w:p>
+        </w:tc>
+        <w:tc>
+          <w:tcPr>
+            <w:tcW w:type="dxa" w:w="3120"/>
+          </w:tcPr>
+          <w:p>
+            <w:r>
+              <w:t>Header 0.1</w:t>
+            </w:r>
+          </w:p>
+        </w:tc>
+        <w:tc>
+          <w:tcPr>
+            <w:tcW w:type="dxa" w:w="3120"/>
+            <w:vMerge w:val="restart"/>
+          </w:tcPr>
+          <w:p>
+            <w:r>
+              <w:t>Merged Cell 0.2 1.2</w:t>
+            </w:r>
+          </w:p>
+        </w:tc>
+      </w:tr>
+      <w:tr>
+        <w:trPr>
+          <w:gridBefore w:val="2"/>
+        </w:trPr>
+        <w:tc>
+          <w:tcPr>
+            <w:tcW w:type="dxa" w:w="3120"/>
+            <w:vMerge/>
+          </w:tcPr>
+          <w:p/>
+        </w:tc>
+      </w:tr>
+    </w:tbl>
     <w:sectPr>
       <w:pgSz w:w="12240" w:h="15840"/>
       <w:pgMar w:top="1440" w:right="1440" w:bottom="1440" w:left="1440" w:header="720" w:footer="720" w:gutter="0"/>

</xml_diff>